<commit_message>
Remove the brand and country-of-origin fields
Drops brand/country from the line-item model, the items table UI, and the route
payload, and removes the BRAND / COUNTRY OF ORIGIN columns from the drug-loft
proforma template (grid 9→7 cols; totals/words gridSpans adjusted). The
drug-loft proforma now renders a clean NO/DESCRIPTION/QTY/UNIT/PRICE/TOTAL table.

Co-Authored-By: Claude Opus 4.8 <noreply@anthropic.com>
</commit_message>
<xml_diff>
--- a/public/templates/drug-loft/proforma/ PROFORMA INVOICE.docx
+++ b/public/templates/drug-loft/proforma/ PROFORMA INVOICE.docx
@@ -369,8 +369,6 @@
         <w:gridCol w:w="3127"/>
         <w:gridCol w:w="720"/>
         <w:gridCol w:w="863"/>
-        <w:gridCol w:w="1207"/>
-        <w:gridCol w:w="1237"/>
         <w:gridCol w:w="7"/>
         <w:gridCol w:w="1280"/>
         <w:gridCol w:w="1583"/>
@@ -490,119 +488,6 @@
         </w:tc>
         <w:tc>
           <w:tcPr>
-            <w:tcW w:w="1210" w:type="dxa"/>
-            <w:vAlign w:val="center"/>
-          </w:tcPr>
-          <w:p>
-            <w:pPr>
-              <w:spacing w:before="240"/>
-              <w:ind w:left="5"/>
-              <w:jc w:val="center"/>
-              <w:rPr>
-                <w:rFonts w:ascii="Times New Roman" w:eastAsia="Candara" w:hAnsi="Times New Roman" w:cs="Times New Roman"/>
-                <w:b/>
-                <w:sz w:val="23"/>
-                <w:szCs w:val="23"/>
-              </w:rPr>
-            </w:pPr>
-            <w:r>
-              <w:rPr>
-                <w:rFonts w:ascii="Times New Roman" w:eastAsia="Candara" w:hAnsi="Times New Roman" w:cs="Times New Roman"/>
-                <w:b/>
-                <w:sz w:val="23"/>
-                <w:szCs w:val="23"/>
-              </w:rPr>
-              <w:t>BRAND</w:t>
-            </w:r>
-          </w:p>
-        </w:tc>
-        <w:tc>
-          <w:tcPr>
-            <w:tcW w:w="1237" w:type="dxa"/>
-            <w:vAlign w:val="center"/>
-          </w:tcPr>
-          <w:p>
-            <w:pPr>
-              <w:spacing w:after="0" w:line="240" w:lineRule="auto"/>
-              <w:ind w:left="5"/>
-              <w:jc w:val="center"/>
-              <w:rPr>
-                <w:rFonts w:ascii="Times New Roman" w:eastAsia="Candara" w:hAnsi="Times New Roman" w:cs="Times New Roman"/>
-                <w:b/>
-                <w:sz w:val="23"/>
-                <w:szCs w:val="23"/>
-              </w:rPr>
-            </w:pPr>
-          </w:p>
-          <w:p>
-            <w:pPr>
-              <w:spacing w:after="0" w:line="240" w:lineRule="auto"/>
-              <w:ind w:left="5"/>
-              <w:jc w:val="center"/>
-              <w:rPr>
-                <w:rFonts w:ascii="Times New Roman" w:eastAsia="Candara" w:hAnsi="Times New Roman" w:cs="Times New Roman"/>
-                <w:b/>
-                <w:sz w:val="20"/>
-                <w:szCs w:val="20"/>
-              </w:rPr>
-            </w:pPr>
-            <w:r>
-              <w:rPr>
-                <w:rFonts w:ascii="Times New Roman" w:eastAsia="Candara" w:hAnsi="Times New Roman" w:cs="Times New Roman"/>
-                <w:b/>
-                <w:sz w:val="20"/>
-                <w:szCs w:val="20"/>
-              </w:rPr>
-              <w:t>COUNTRY</w:t>
-            </w:r>
-          </w:p>
-          <w:p>
-            <w:pPr>
-              <w:spacing w:after="0" w:line="240" w:lineRule="auto"/>
-              <w:ind w:left="5"/>
-              <w:jc w:val="center"/>
-              <w:rPr>
-                <w:rFonts w:ascii="Times New Roman" w:eastAsia="Candara" w:hAnsi="Times New Roman" w:cs="Times New Roman"/>
-                <w:b/>
-                <w:sz w:val="20"/>
-                <w:szCs w:val="20"/>
-              </w:rPr>
-            </w:pPr>
-            <w:r>
-              <w:rPr>
-                <w:rFonts w:ascii="Times New Roman" w:eastAsia="Candara" w:hAnsi="Times New Roman" w:cs="Times New Roman"/>
-                <w:b/>
-                <w:sz w:val="20"/>
-                <w:szCs w:val="20"/>
-              </w:rPr>
-              <w:t>OF</w:t>
-            </w:r>
-          </w:p>
-          <w:p>
-            <w:pPr>
-              <w:spacing w:after="0" w:line="240" w:lineRule="auto"/>
-              <w:ind w:left="5"/>
-              <w:jc w:val="center"/>
-              <w:rPr>
-                <w:rFonts w:ascii="Times New Roman" w:eastAsia="Candara" w:hAnsi="Times New Roman" w:cs="Times New Roman"/>
-                <w:b/>
-                <w:sz w:val="23"/>
-                <w:szCs w:val="23"/>
-              </w:rPr>
-            </w:pPr>
-            <w:r>
-              <w:rPr>
-                <w:rFonts w:ascii="Times New Roman" w:eastAsia="Candara" w:hAnsi="Times New Roman" w:cs="Times New Roman"/>
-                <w:b/>
-                <w:sz w:val="20"/>
-                <w:szCs w:val="20"/>
-              </w:rPr>
-              <w:t>ORIGIN</w:t>
-            </w:r>
-          </w:p>
-        </w:tc>
-        <w:tc>
-          <w:tcPr>
             <w:tcW w:w="1187" w:type="dxa"/>
             <w:gridSpan w:val="2"/>
             <w:vAlign w:val="center"/>
@@ -803,60 +688,6 @@
         </w:tc>
         <w:tc>
           <w:tcPr>
-            <w:tcW w:w="1210" w:type="dxa"/>
-            <w:vAlign w:val="center"/>
-          </w:tcPr>
-          <w:p>
-            <w:pPr>
-              <w:spacing w:after="0"/>
-              <w:jc w:val="center"/>
-              <w:rPr>
-                <w:rFonts w:ascii="Candara" w:hAnsi="Candara"/>
-                <w:color w:val="000000"/>
-                <w:sz w:val="23"/>
-                <w:szCs w:val="23"/>
-              </w:rPr>
-            </w:pPr>
-            <w:r>
-              <w:rPr>
-                <w:rFonts w:ascii="Candara" w:hAnsi="Candara"/>
-                <w:color w:val="000000"/>
-                <w:sz w:val="23"/>
-                <w:szCs w:val="23"/>
-              </w:rPr>
-              <w:t>{{brand}}</w:t>
-            </w:r>
-          </w:p>
-        </w:tc>
-        <w:tc>
-          <w:tcPr>
-            <w:tcW w:w="1237" w:type="dxa"/>
-            <w:vAlign w:val="center"/>
-          </w:tcPr>
-          <w:p>
-            <w:pPr>
-              <w:spacing w:after="0"/>
-              <w:jc w:val="center"/>
-              <w:rPr>
-                <w:rFonts w:ascii="Candara" w:hAnsi="Candara"/>
-                <w:color w:val="000000"/>
-                <w:sz w:val="23"/>
-                <w:szCs w:val="23"/>
-              </w:rPr>
-            </w:pPr>
-            <w:r>
-              <w:rPr>
-                <w:rFonts w:ascii="Candara" w:hAnsi="Candara"/>
-                <w:color w:val="000000"/>
-                <w:sz w:val="23"/>
-                <w:szCs w:val="23"/>
-              </w:rPr>
-              <w:t>{{country}}</w:t>
-            </w:r>
-          </w:p>
-        </w:tc>
-        <w:tc>
-          <w:tcPr>
             <w:tcW w:w="1187" w:type="dxa"/>
             <w:gridSpan w:val="2"/>
             <w:vAlign w:val="center"/>
@@ -921,7 +752,7 @@
         <w:tc>
           <w:tcPr>
             <w:tcW w:w="8021" w:type="dxa"/>
-            <w:gridSpan w:val="7"/>
+            <w:gridSpan w:val="5"/>
             <w:vAlign w:val="center"/>
           </w:tcPr>
           <w:p>
@@ -1000,7 +831,7 @@
         <w:tc>
           <w:tcPr>
             <w:tcW w:w="8021" w:type="dxa"/>
-            <w:gridSpan w:val="7"/>
+            <w:gridSpan w:val="5"/>
             <w:vAlign w:val="center"/>
           </w:tcPr>
           <w:p>
@@ -1079,7 +910,7 @@
         <w:tc>
           <w:tcPr>
             <w:tcW w:w="8021" w:type="dxa"/>
-            <w:gridSpan w:val="7"/>
+            <w:gridSpan w:val="5"/>
             <w:vAlign w:val="center"/>
           </w:tcPr>
           <w:p>
@@ -1158,7 +989,7 @@
         <w:tc>
           <w:tcPr>
             <w:tcW w:w="10800" w:type="dxa"/>
-            <w:gridSpan w:val="9"/>
+            <w:gridSpan w:val="7"/>
             <w:vAlign w:val="center"/>
           </w:tcPr>
           <w:p>

</xml_diff>